<commit_message>
Day18-Completed Social media Data Analysis
</commit_message>
<xml_diff>
--- a/Day18/Day18.docx
+++ b/Day18/Day18.docx
@@ -558,10 +558,10 @@
           <w:noProof/>
         </w:rPr>
         <w:drawing>
-          <wp:inline distT="0" distB="0" distL="0" distR="0" wp14:anchorId="5302E166" wp14:editId="5662483E">
-            <wp:extent cx="5495817" cy="3673899"/>
-            <wp:effectExtent l="0" t="0" r="0" b="3175"/>
-            <wp:docPr id="529401207" name="Picture 9"/>
+          <wp:inline distT="0" distB="0" distL="0" distR="0" wp14:anchorId="1B4F4945" wp14:editId="23514B2F">
+            <wp:extent cx="4623932" cy="2596374"/>
+            <wp:effectExtent l="0" t="0" r="5715" b="0"/>
+            <wp:docPr id="2020521683" name="Picture 1"/>
             <wp:cNvGraphicFramePr>
               <a:graphicFrameLocks xmlns:a="http://schemas.openxmlformats.org/drawingml/2006/main" noChangeAspect="1"/>
             </wp:cNvGraphicFramePr>
@@ -569,7 +569,7 @@
               <a:graphicData uri="http://schemas.openxmlformats.org/drawingml/2006/picture">
                 <pic:pic xmlns:pic="http://schemas.openxmlformats.org/drawingml/2006/picture">
                   <pic:nvPicPr>
-                    <pic:cNvPr id="529401207" name="Picture 529401207"/>
+                    <pic:cNvPr id="2020521683" name="Picture 2020521683"/>
                     <pic:cNvPicPr/>
                   </pic:nvPicPr>
                   <pic:blipFill>
@@ -587,7 +587,7 @@
                   <pic:spPr>
                     <a:xfrm>
                       <a:off x="0" y="0"/>
-                      <a:ext cx="5526530" cy="3694430"/>
+                      <a:ext cx="4631937" cy="2600869"/>
                     </a:xfrm>
                     <a:prstGeom prst="rect">
                       <a:avLst/>
@@ -1496,6 +1496,7 @@
   <w:style w:type="character" w:default="1" w:styleId="DefaultParagraphFont">
     <w:name w:val="Default Paragraph Font"/>
     <w:uiPriority w:val="1"/>
+    <w:semiHidden/>
     <w:unhideWhenUsed/>
   </w:style>
   <w:style w:type="table" w:default="1" w:styleId="TableNormal">

</xml_diff>